<commit_message>
AAD_5 + Scientific work
</commit_message>
<xml_diff>
--- a/Science_code/Theory/Хоффман_Завадостійкий_код_Теорія_Наукова_робота.docx
+++ b/Science_code/Theory/Хоффман_Завадостійкий_код_Теорія_Наукова_робота.docx
@@ -17515,6 +17515,409 @@
         <w:rPr>
           <w:sz w:val="28"/>
           <w:szCs w:val="28"/>
+          <w:lang w:val="en-US"/>
+        </w:rPr>
+      </w:pPr>
+    </w:p>
+    <w:p>
+      <w:pPr>
+        <w:rPr>
+          <w:sz w:val="28"/>
+          <w:szCs w:val="28"/>
+          <w:lang w:val="en-US"/>
+        </w:rPr>
+      </w:pPr>
+    </w:p>
+    <w:p>
+      <w:pPr>
+        <w:pBdr>
+          <w:bottom w:val="single" w:sz="6" w:space="1" w:color="auto"/>
+        </w:pBdr>
+        <w:rPr>
+          <w:sz w:val="28"/>
+          <w:szCs w:val="28"/>
+          <w:lang w:val="en-US"/>
+        </w:rPr>
+      </w:pPr>
+    </w:p>
+    <w:p>
+      <w:pPr>
+        <w:rPr>
+          <w:b/>
+          <w:bCs/>
+          <w:sz w:val="28"/>
+          <w:szCs w:val="28"/>
+        </w:rPr>
+      </w:pPr>
+      <w:r>
+        <w:rPr>
+          <w:b/>
+          <w:bCs/>
+          <w:sz w:val="28"/>
+          <w:szCs w:val="28"/>
+        </w:rPr>
+        <w:t>1. Профіль хвостових нулів (Аналіз степеня двійки)</w:t>
+      </w:r>
+    </w:p>
+    <w:p>
+      <w:pPr>
+        <w:rPr>
+          <w:sz w:val="28"/>
+          <w:szCs w:val="28"/>
+        </w:rPr>
+      </w:pPr>
+      <w:r>
+        <w:rPr>
+          <w:sz w:val="28"/>
+          <w:szCs w:val="28"/>
+        </w:rPr>
+        <w:t xml:space="preserve">Це найперспективніша метрика. Оскільки 32-бітний блок — це бінарний код, наявність у ньому множника </w:t>
+      </w:r>
+      <m:oMath>
+        <m:r>
+          <w:rPr>
+            <w:rFonts w:ascii="Cambria Math" w:hAnsi="Cambria Math"/>
+            <w:sz w:val="28"/>
+            <w:szCs w:val="28"/>
+          </w:rPr>
+          <m:t>2</m:t>
+        </m:r>
+      </m:oMath>
+      <w:r>
+        <w:rPr>
+          <w:sz w:val="28"/>
+          <w:szCs w:val="28"/>
+        </w:rPr>
+        <w:t xml:space="preserve"> означає, що число парне (закінчується на 0). Степінь двійки (наприклад, </w:t>
+      </w:r>
+      <m:oMath>
+        <m:sSup>
+          <m:sSupPr>
+            <m:ctrlPr>
+              <w:rPr>
+                <w:rFonts w:ascii="Cambria Math" w:hAnsi="Cambria Math"/>
+                <w:sz w:val="28"/>
+                <w:szCs w:val="28"/>
+              </w:rPr>
+            </m:ctrlPr>
+          </m:sSupPr>
+          <m:e>
+            <m:r>
+              <w:rPr>
+                <w:rFonts w:ascii="Cambria Math" w:hAnsi="Cambria Math"/>
+                <w:sz w:val="28"/>
+                <w:szCs w:val="28"/>
+              </w:rPr>
+              <m:t>2</m:t>
+            </m:r>
+          </m:e>
+          <m:sup>
+            <m:r>
+              <w:rPr>
+                <w:rFonts w:ascii="Cambria Math" w:hAnsi="Cambria Math"/>
+                <w:sz w:val="28"/>
+                <w:szCs w:val="28"/>
+              </w:rPr>
+              <m:t>5</m:t>
+            </m:r>
+          </m:sup>
+        </m:sSup>
+      </m:oMath>
+      <w:r>
+        <w:rPr>
+          <w:sz w:val="28"/>
+          <w:szCs w:val="28"/>
+        </w:rPr>
+        <w:t xml:space="preserve">) математично означає, що </w:t>
+      </w:r>
+      <w:r>
+        <w:rPr>
+          <w:b/>
+          <w:bCs/>
+          <w:sz w:val="28"/>
+          <w:szCs w:val="28"/>
+        </w:rPr>
+        <w:t>останні 5 бітів цього блоку — це нулі</w:t>
+      </w:r>
+      <w:r>
+        <w:rPr>
+          <w:sz w:val="28"/>
+          <w:szCs w:val="28"/>
+        </w:rPr>
+        <w:t xml:space="preserve"> (...100000).</w:t>
+      </w:r>
+    </w:p>
+    <w:p>
+      <w:pPr>
+        <w:numPr>
+          <w:ilvl w:val="0"/>
+          <w:numId w:val="36"/>
+        </w:numPr>
+        <w:rPr>
+          <w:sz w:val="28"/>
+          <w:szCs w:val="28"/>
+        </w:rPr>
+      </w:pPr>
+      <w:r>
+        <w:rPr>
+          <w:b/>
+          <w:bCs/>
+          <w:sz w:val="28"/>
+          <w:szCs w:val="28"/>
+        </w:rPr>
+        <w:t>Чому це ловить ШІ:</w:t>
+      </w:r>
+      <w:r>
+        <w:rPr>
+          <w:sz w:val="28"/>
+          <w:szCs w:val="28"/>
+        </w:rPr>
+        <w:t xml:space="preserve"> У дереві Гаффмана найчастіші символи (пробіл, літери 'о', 'а', 'е') отримують найкоротші коди (наприклад, 01 або 000). Оскільки ШІ використовує дуже обмежений і передбачуваний словник, певні короткі коди будуть генеруватися масово. Це призведе до того, що на місцях розрізу 32-бітних блоків з'явиться </w:t>
+      </w:r>
+      <w:r>
+        <w:rPr>
+          <w:b/>
+          <w:bCs/>
+          <w:sz w:val="28"/>
+          <w:szCs w:val="28"/>
+        </w:rPr>
+        <w:t>аномальний статистичний перекіс</w:t>
+      </w:r>
+      <w:r>
+        <w:rPr>
+          <w:sz w:val="28"/>
+          <w:szCs w:val="28"/>
+        </w:rPr>
+        <w:t xml:space="preserve"> у кількості хвостових нулів (степенів двійки).</w:t>
+      </w:r>
+    </w:p>
+    <w:p>
+      <w:pPr>
+        <w:rPr>
+          <w:sz w:val="28"/>
+          <w:szCs w:val="28"/>
+        </w:rPr>
+      </w:pPr>
+      <w:r>
+        <w:rPr>
+          <w:sz w:val="28"/>
+          <w:szCs w:val="28"/>
+        </w:rPr>
+        <w:t>У людини кількість хвостових нулів буде спадати за ідеальним експоненціальним законом випадковості, а у ШІ можуть вилізти "горби" на певних степенях.</w:t>
+      </w:r>
+    </w:p>
+    <w:p>
+      <w:pPr>
+        <w:rPr>
+          <w:b/>
+          <w:bCs/>
+          <w:sz w:val="28"/>
+          <w:szCs w:val="28"/>
+        </w:rPr>
+      </w:pPr>
+      <w:r>
+        <w:rPr>
+          <w:b/>
+          <w:bCs/>
+          <w:sz w:val="28"/>
+          <w:szCs w:val="28"/>
+        </w:rPr>
+        <w:t>2. Інформаційна Ентропія масиву степенів (Розподіл енергії)</w:t>
+      </w:r>
+    </w:p>
+    <w:p>
+      <w:pPr>
+        <w:rPr>
+          <w:sz w:val="28"/>
+          <w:szCs w:val="28"/>
+        </w:rPr>
+      </w:pPr>
+      <w:r>
+        <w:rPr>
+          <w:sz w:val="28"/>
+          <w:szCs w:val="28"/>
+        </w:rPr>
+        <w:t>Замість того, щоб просто додавати всі степені (як ми робили в Індексі Гладкості), ми можемо дивитися на їхній баланс.</w:t>
+      </w:r>
+    </w:p>
+    <w:p>
+      <w:pPr>
+        <w:numPr>
+          <w:ilvl w:val="0"/>
+          <w:numId w:val="37"/>
+        </w:numPr>
+        <w:rPr>
+          <w:sz w:val="28"/>
+          <w:szCs w:val="28"/>
+        </w:rPr>
+      </w:pPr>
+      <w:r>
+        <w:rPr>
+          <w:sz w:val="28"/>
+          <w:szCs w:val="28"/>
+        </w:rPr>
+        <w:t>Блок А: exponents = [1, 1, 1, 1, 1] (5 різних простих дільників).</w:t>
+      </w:r>
+    </w:p>
+    <w:p>
+      <w:pPr>
+        <w:numPr>
+          <w:ilvl w:val="0"/>
+          <w:numId w:val="37"/>
+        </w:numPr>
+        <w:rPr>
+          <w:sz w:val="28"/>
+          <w:szCs w:val="28"/>
+        </w:rPr>
+      </w:pPr>
+      <w:r>
+        <w:rPr>
+          <w:sz w:val="28"/>
+          <w:szCs w:val="28"/>
+        </w:rPr>
+        <w:t xml:space="preserve">Блок Б: exponents = [5] (один дільник у 5-му степені, наприклад </w:t>
+      </w:r>
+      <m:oMath>
+        <m:sSup>
+          <m:sSupPr>
+            <m:ctrlPr>
+              <w:rPr>
+                <w:rFonts w:ascii="Cambria Math" w:hAnsi="Cambria Math"/>
+                <w:sz w:val="28"/>
+                <w:szCs w:val="28"/>
+              </w:rPr>
+            </m:ctrlPr>
+          </m:sSupPr>
+          <m:e>
+            <m:r>
+              <w:rPr>
+                <w:rFonts w:ascii="Cambria Math" w:hAnsi="Cambria Math"/>
+                <w:sz w:val="28"/>
+                <w:szCs w:val="28"/>
+              </w:rPr>
+              <m:t>2</m:t>
+            </m:r>
+          </m:e>
+          <m:sup>
+            <m:r>
+              <w:rPr>
+                <w:rFonts w:ascii="Cambria Math" w:hAnsi="Cambria Math"/>
+                <w:sz w:val="28"/>
+                <w:szCs w:val="28"/>
+              </w:rPr>
+              <m:t>5</m:t>
+            </m:r>
+          </m:sup>
+        </m:sSup>
+      </m:oMath>
+      <w:r>
+        <w:rPr>
+          <w:sz w:val="28"/>
+          <w:szCs w:val="28"/>
+        </w:rPr>
+        <w:t>).</w:t>
+      </w:r>
+    </w:p>
+    <w:p>
+      <w:pPr>
+        <w:rPr>
+          <w:sz w:val="28"/>
+          <w:szCs w:val="28"/>
+        </w:rPr>
+      </w:pPr>
+      <w:r>
+        <w:rPr>
+          <w:sz w:val="28"/>
+          <w:szCs w:val="28"/>
+        </w:rPr>
+        <w:lastRenderedPageBreak/>
+        <w:t>Сума в обох випадках дорівнює 5. Але їхня ентропія кардинально різна. Ми можемо розраховувати відношення максимального степеня до загальної суми степенів. Це покаже, наскільки число "сконцентроване" навколо одного множника.</w:t>
+      </w:r>
+    </w:p>
+    <w:p>
+      <w:pPr>
+        <w:rPr>
+          <w:b/>
+          <w:bCs/>
+          <w:sz w:val="28"/>
+          <w:szCs w:val="28"/>
+        </w:rPr>
+      </w:pPr>
+      <w:r>
+        <w:rPr>
+          <w:b/>
+          <w:bCs/>
+          <w:sz w:val="28"/>
+          <w:szCs w:val="28"/>
+        </w:rPr>
+        <w:t>3. Коефіцієнт розриву дільників (Prime Gap Ratio)</w:t>
+      </w:r>
+    </w:p>
+    <w:p>
+      <w:pPr>
+        <w:rPr>
+          <w:sz w:val="28"/>
+          <w:szCs w:val="28"/>
+        </w:rPr>
+      </w:pPr>
+      <w:r>
+        <w:rPr>
+          <w:sz w:val="28"/>
+          <w:szCs w:val="28"/>
+        </w:rPr>
+        <w:t>Для кожного блоку ми беремо найбільший дільник (LPF) і ділимо його на другий за величиною дільник (Second Largest Prime Factor).</w:t>
+      </w:r>
+    </w:p>
+    <w:p>
+      <w:pPr>
+        <w:numPr>
+          <w:ilvl w:val="0"/>
+          <w:numId w:val="38"/>
+        </w:numPr>
+        <w:rPr>
+          <w:sz w:val="28"/>
+          <w:szCs w:val="28"/>
+        </w:rPr>
+      </w:pPr>
+      <w:r>
+        <w:rPr>
+          <w:b/>
+          <w:bCs/>
+          <w:sz w:val="28"/>
+          <w:szCs w:val="28"/>
+        </w:rPr>
+        <w:t>Чому це працює:</w:t>
+      </w:r>
+      <w:r>
+        <w:rPr>
+          <w:sz w:val="28"/>
+          <w:szCs w:val="28"/>
+        </w:rPr>
+        <w:t xml:space="preserve"> Це показує "форму" числа. Якщо ШІ генерує специфічні синтаксичні патерни, вони можуть "збивати" факторизацію в певні класи чисел — наприклад, числа, де один дільник гігантський, а всі інші — мікроскопічні.</w:t>
+      </w:r>
+    </w:p>
+    <w:p>
+      <w:pPr>
+        <w:rPr>
+          <w:sz w:val="28"/>
+          <w:szCs w:val="28"/>
+          <w:lang w:val="en-US"/>
+        </w:rPr>
+      </w:pPr>
+    </w:p>
+    <w:p>
+      <w:pPr>
+        <w:rPr>
+          <w:sz w:val="28"/>
+          <w:szCs w:val="28"/>
+        </w:rPr>
+      </w:pPr>
+    </w:p>
+    <w:p>
+      <w:pPr>
+        <w:rPr>
+          <w:sz w:val="28"/>
+          <w:szCs w:val="28"/>
         </w:rPr>
       </w:pPr>
     </w:p>
@@ -18467,6 +18870,155 @@
     </w:lvl>
   </w:abstractNum>
   <w:abstractNum w:abstractNumId="6" w15:restartNumberingAfterBreak="0">
+    <w:nsid w:val="10AB2592"/>
+    <w:multiLevelType w:val="multilevel"/>
+    <w:tmpl w:val="32042864"/>
+    <w:lvl w:ilvl="0">
+      <w:start w:val="1"/>
+      <w:numFmt w:val="bullet"/>
+      <w:lvlText w:val=""/>
+      <w:lvlJc w:val="left"/>
+      <w:pPr>
+        <w:tabs>
+          <w:tab w:val="num" w:pos="720"/>
+        </w:tabs>
+        <w:ind w:left="720" w:hanging="360"/>
+      </w:pPr>
+      <w:rPr>
+        <w:rFonts w:ascii="Symbol" w:hAnsi="Symbol" w:hint="default"/>
+        <w:sz w:val="20"/>
+      </w:rPr>
+    </w:lvl>
+    <w:lvl w:ilvl="1" w:tentative="1">
+      <w:start w:val="1"/>
+      <w:numFmt w:val="bullet"/>
+      <w:lvlText w:val="o"/>
+      <w:lvlJc w:val="left"/>
+      <w:pPr>
+        <w:tabs>
+          <w:tab w:val="num" w:pos="1440"/>
+        </w:tabs>
+        <w:ind w:left="1440" w:hanging="360"/>
+      </w:pPr>
+      <w:rPr>
+        <w:rFonts w:ascii="Courier New" w:hAnsi="Courier New" w:hint="default"/>
+        <w:sz w:val="20"/>
+      </w:rPr>
+    </w:lvl>
+    <w:lvl w:ilvl="2" w:tentative="1">
+      <w:start w:val="1"/>
+      <w:numFmt w:val="bullet"/>
+      <w:lvlText w:val=""/>
+      <w:lvlJc w:val="left"/>
+      <w:pPr>
+        <w:tabs>
+          <w:tab w:val="num" w:pos="2160"/>
+        </w:tabs>
+        <w:ind w:left="2160" w:hanging="360"/>
+      </w:pPr>
+      <w:rPr>
+        <w:rFonts w:ascii="Wingdings" w:hAnsi="Wingdings" w:hint="default"/>
+        <w:sz w:val="20"/>
+      </w:rPr>
+    </w:lvl>
+    <w:lvl w:ilvl="3" w:tentative="1">
+      <w:start w:val="1"/>
+      <w:numFmt w:val="bullet"/>
+      <w:lvlText w:val=""/>
+      <w:lvlJc w:val="left"/>
+      <w:pPr>
+        <w:tabs>
+          <w:tab w:val="num" w:pos="2880"/>
+        </w:tabs>
+        <w:ind w:left="2880" w:hanging="360"/>
+      </w:pPr>
+      <w:rPr>
+        <w:rFonts w:ascii="Wingdings" w:hAnsi="Wingdings" w:hint="default"/>
+        <w:sz w:val="20"/>
+      </w:rPr>
+    </w:lvl>
+    <w:lvl w:ilvl="4" w:tentative="1">
+      <w:start w:val="1"/>
+      <w:numFmt w:val="bullet"/>
+      <w:lvlText w:val=""/>
+      <w:lvlJc w:val="left"/>
+      <w:pPr>
+        <w:tabs>
+          <w:tab w:val="num" w:pos="3600"/>
+        </w:tabs>
+        <w:ind w:left="3600" w:hanging="360"/>
+      </w:pPr>
+      <w:rPr>
+        <w:rFonts w:ascii="Wingdings" w:hAnsi="Wingdings" w:hint="default"/>
+        <w:sz w:val="20"/>
+      </w:rPr>
+    </w:lvl>
+    <w:lvl w:ilvl="5" w:tentative="1">
+      <w:start w:val="1"/>
+      <w:numFmt w:val="bullet"/>
+      <w:lvlText w:val=""/>
+      <w:lvlJc w:val="left"/>
+      <w:pPr>
+        <w:tabs>
+          <w:tab w:val="num" w:pos="4320"/>
+        </w:tabs>
+        <w:ind w:left="4320" w:hanging="360"/>
+      </w:pPr>
+      <w:rPr>
+        <w:rFonts w:ascii="Wingdings" w:hAnsi="Wingdings" w:hint="default"/>
+        <w:sz w:val="20"/>
+      </w:rPr>
+    </w:lvl>
+    <w:lvl w:ilvl="6" w:tentative="1">
+      <w:start w:val="1"/>
+      <w:numFmt w:val="bullet"/>
+      <w:lvlText w:val=""/>
+      <w:lvlJc w:val="left"/>
+      <w:pPr>
+        <w:tabs>
+          <w:tab w:val="num" w:pos="5040"/>
+        </w:tabs>
+        <w:ind w:left="5040" w:hanging="360"/>
+      </w:pPr>
+      <w:rPr>
+        <w:rFonts w:ascii="Wingdings" w:hAnsi="Wingdings" w:hint="default"/>
+        <w:sz w:val="20"/>
+      </w:rPr>
+    </w:lvl>
+    <w:lvl w:ilvl="7" w:tentative="1">
+      <w:start w:val="1"/>
+      <w:numFmt w:val="bullet"/>
+      <w:lvlText w:val=""/>
+      <w:lvlJc w:val="left"/>
+      <w:pPr>
+        <w:tabs>
+          <w:tab w:val="num" w:pos="5760"/>
+        </w:tabs>
+        <w:ind w:left="5760" w:hanging="360"/>
+      </w:pPr>
+      <w:rPr>
+        <w:rFonts w:ascii="Wingdings" w:hAnsi="Wingdings" w:hint="default"/>
+        <w:sz w:val="20"/>
+      </w:rPr>
+    </w:lvl>
+    <w:lvl w:ilvl="8" w:tentative="1">
+      <w:start w:val="1"/>
+      <w:numFmt w:val="bullet"/>
+      <w:lvlText w:val=""/>
+      <w:lvlJc w:val="left"/>
+      <w:pPr>
+        <w:tabs>
+          <w:tab w:val="num" w:pos="6480"/>
+        </w:tabs>
+        <w:ind w:left="6480" w:hanging="360"/>
+      </w:pPr>
+      <w:rPr>
+        <w:rFonts w:ascii="Wingdings" w:hAnsi="Wingdings" w:hint="default"/>
+        <w:sz w:val="20"/>
+      </w:rPr>
+    </w:lvl>
+  </w:abstractNum>
+  <w:abstractNum w:abstractNumId="7" w15:restartNumberingAfterBreak="0">
     <w:nsid w:val="146A6DDD"/>
     <w:multiLevelType w:val="multilevel"/>
     <w:tmpl w:val="FFD8CD00"/>
@@ -18615,7 +19167,7 @@
       </w:rPr>
     </w:lvl>
   </w:abstractNum>
-  <w:abstractNum w:abstractNumId="7" w15:restartNumberingAfterBreak="0">
+  <w:abstractNum w:abstractNumId="8" w15:restartNumberingAfterBreak="0">
     <w:nsid w:val="18FB7A85"/>
     <w:multiLevelType w:val="multilevel"/>
     <w:tmpl w:val="4B36D7AC"/>
@@ -18728,7 +19280,7 @@
       </w:pPr>
     </w:lvl>
   </w:abstractNum>
-  <w:abstractNum w:abstractNumId="8" w15:restartNumberingAfterBreak="0">
+  <w:abstractNum w:abstractNumId="9" w15:restartNumberingAfterBreak="0">
     <w:nsid w:val="1E1009EA"/>
     <w:multiLevelType w:val="multilevel"/>
     <w:tmpl w:val="0BC4B670"/>
@@ -18877,7 +19429,7 @@
       </w:rPr>
     </w:lvl>
   </w:abstractNum>
-  <w:abstractNum w:abstractNumId="9" w15:restartNumberingAfterBreak="0">
+  <w:abstractNum w:abstractNumId="10" w15:restartNumberingAfterBreak="0">
     <w:nsid w:val="21CC3C0E"/>
     <w:multiLevelType w:val="multilevel"/>
     <w:tmpl w:val="4E5C9E26"/>
@@ -19026,7 +19578,7 @@
       </w:rPr>
     </w:lvl>
   </w:abstractNum>
-  <w:abstractNum w:abstractNumId="10" w15:restartNumberingAfterBreak="0">
+  <w:abstractNum w:abstractNumId="11" w15:restartNumberingAfterBreak="0">
     <w:nsid w:val="22764CFB"/>
     <w:multiLevelType w:val="multilevel"/>
     <w:tmpl w:val="D6E6B120"/>
@@ -19175,7 +19727,156 @@
       </w:rPr>
     </w:lvl>
   </w:abstractNum>
-  <w:abstractNum w:abstractNumId="11" w15:restartNumberingAfterBreak="0">
+  <w:abstractNum w:abstractNumId="12" w15:restartNumberingAfterBreak="0">
+    <w:nsid w:val="255B45B9"/>
+    <w:multiLevelType w:val="multilevel"/>
+    <w:tmpl w:val="1278E85C"/>
+    <w:lvl w:ilvl="0">
+      <w:start w:val="1"/>
+      <w:numFmt w:val="bullet"/>
+      <w:lvlText w:val=""/>
+      <w:lvlJc w:val="left"/>
+      <w:pPr>
+        <w:tabs>
+          <w:tab w:val="num" w:pos="720"/>
+        </w:tabs>
+        <w:ind w:left="720" w:hanging="360"/>
+      </w:pPr>
+      <w:rPr>
+        <w:rFonts w:ascii="Symbol" w:hAnsi="Symbol" w:hint="default"/>
+        <w:sz w:val="20"/>
+      </w:rPr>
+    </w:lvl>
+    <w:lvl w:ilvl="1" w:tentative="1">
+      <w:start w:val="1"/>
+      <w:numFmt w:val="bullet"/>
+      <w:lvlText w:val="o"/>
+      <w:lvlJc w:val="left"/>
+      <w:pPr>
+        <w:tabs>
+          <w:tab w:val="num" w:pos="1440"/>
+        </w:tabs>
+        <w:ind w:left="1440" w:hanging="360"/>
+      </w:pPr>
+      <w:rPr>
+        <w:rFonts w:ascii="Courier New" w:hAnsi="Courier New" w:hint="default"/>
+        <w:sz w:val="20"/>
+      </w:rPr>
+    </w:lvl>
+    <w:lvl w:ilvl="2" w:tentative="1">
+      <w:start w:val="1"/>
+      <w:numFmt w:val="bullet"/>
+      <w:lvlText w:val=""/>
+      <w:lvlJc w:val="left"/>
+      <w:pPr>
+        <w:tabs>
+          <w:tab w:val="num" w:pos="2160"/>
+        </w:tabs>
+        <w:ind w:left="2160" w:hanging="360"/>
+      </w:pPr>
+      <w:rPr>
+        <w:rFonts w:ascii="Wingdings" w:hAnsi="Wingdings" w:hint="default"/>
+        <w:sz w:val="20"/>
+      </w:rPr>
+    </w:lvl>
+    <w:lvl w:ilvl="3" w:tentative="1">
+      <w:start w:val="1"/>
+      <w:numFmt w:val="bullet"/>
+      <w:lvlText w:val=""/>
+      <w:lvlJc w:val="left"/>
+      <w:pPr>
+        <w:tabs>
+          <w:tab w:val="num" w:pos="2880"/>
+        </w:tabs>
+        <w:ind w:left="2880" w:hanging="360"/>
+      </w:pPr>
+      <w:rPr>
+        <w:rFonts w:ascii="Wingdings" w:hAnsi="Wingdings" w:hint="default"/>
+        <w:sz w:val="20"/>
+      </w:rPr>
+    </w:lvl>
+    <w:lvl w:ilvl="4" w:tentative="1">
+      <w:start w:val="1"/>
+      <w:numFmt w:val="bullet"/>
+      <w:lvlText w:val=""/>
+      <w:lvlJc w:val="left"/>
+      <w:pPr>
+        <w:tabs>
+          <w:tab w:val="num" w:pos="3600"/>
+        </w:tabs>
+        <w:ind w:left="3600" w:hanging="360"/>
+      </w:pPr>
+      <w:rPr>
+        <w:rFonts w:ascii="Wingdings" w:hAnsi="Wingdings" w:hint="default"/>
+        <w:sz w:val="20"/>
+      </w:rPr>
+    </w:lvl>
+    <w:lvl w:ilvl="5" w:tentative="1">
+      <w:start w:val="1"/>
+      <w:numFmt w:val="bullet"/>
+      <w:lvlText w:val=""/>
+      <w:lvlJc w:val="left"/>
+      <w:pPr>
+        <w:tabs>
+          <w:tab w:val="num" w:pos="4320"/>
+        </w:tabs>
+        <w:ind w:left="4320" w:hanging="360"/>
+      </w:pPr>
+      <w:rPr>
+        <w:rFonts w:ascii="Wingdings" w:hAnsi="Wingdings" w:hint="default"/>
+        <w:sz w:val="20"/>
+      </w:rPr>
+    </w:lvl>
+    <w:lvl w:ilvl="6" w:tentative="1">
+      <w:start w:val="1"/>
+      <w:numFmt w:val="bullet"/>
+      <w:lvlText w:val=""/>
+      <w:lvlJc w:val="left"/>
+      <w:pPr>
+        <w:tabs>
+          <w:tab w:val="num" w:pos="5040"/>
+        </w:tabs>
+        <w:ind w:left="5040" w:hanging="360"/>
+      </w:pPr>
+      <w:rPr>
+        <w:rFonts w:ascii="Wingdings" w:hAnsi="Wingdings" w:hint="default"/>
+        <w:sz w:val="20"/>
+      </w:rPr>
+    </w:lvl>
+    <w:lvl w:ilvl="7" w:tentative="1">
+      <w:start w:val="1"/>
+      <w:numFmt w:val="bullet"/>
+      <w:lvlText w:val=""/>
+      <w:lvlJc w:val="left"/>
+      <w:pPr>
+        <w:tabs>
+          <w:tab w:val="num" w:pos="5760"/>
+        </w:tabs>
+        <w:ind w:left="5760" w:hanging="360"/>
+      </w:pPr>
+      <w:rPr>
+        <w:rFonts w:ascii="Wingdings" w:hAnsi="Wingdings" w:hint="default"/>
+        <w:sz w:val="20"/>
+      </w:rPr>
+    </w:lvl>
+    <w:lvl w:ilvl="8" w:tentative="1">
+      <w:start w:val="1"/>
+      <w:numFmt w:val="bullet"/>
+      <w:lvlText w:val=""/>
+      <w:lvlJc w:val="left"/>
+      <w:pPr>
+        <w:tabs>
+          <w:tab w:val="num" w:pos="6480"/>
+        </w:tabs>
+        <w:ind w:left="6480" w:hanging="360"/>
+      </w:pPr>
+      <w:rPr>
+        <w:rFonts w:ascii="Wingdings" w:hAnsi="Wingdings" w:hint="default"/>
+        <w:sz w:val="20"/>
+      </w:rPr>
+    </w:lvl>
+  </w:abstractNum>
+  <w:abstractNum w:abstractNumId="13" w15:restartNumberingAfterBreak="0">
     <w:nsid w:val="29B82E1F"/>
     <w:multiLevelType w:val="multilevel"/>
     <w:tmpl w:val="478892E0"/>
@@ -19324,7 +20025,7 @@
       </w:rPr>
     </w:lvl>
   </w:abstractNum>
-  <w:abstractNum w:abstractNumId="12" w15:restartNumberingAfterBreak="0">
+  <w:abstractNum w:abstractNumId="14" w15:restartNumberingAfterBreak="0">
     <w:nsid w:val="2BF101FA"/>
     <w:multiLevelType w:val="multilevel"/>
     <w:tmpl w:val="14D45DEA"/>
@@ -19473,7 +20174,7 @@
       </w:rPr>
     </w:lvl>
   </w:abstractNum>
-  <w:abstractNum w:abstractNumId="13" w15:restartNumberingAfterBreak="0">
+  <w:abstractNum w:abstractNumId="15" w15:restartNumberingAfterBreak="0">
     <w:nsid w:val="2D711601"/>
     <w:multiLevelType w:val="multilevel"/>
     <w:tmpl w:val="9E4659A0"/>
@@ -19622,7 +20323,7 @@
       </w:rPr>
     </w:lvl>
   </w:abstractNum>
-  <w:abstractNum w:abstractNumId="14" w15:restartNumberingAfterBreak="0">
+  <w:abstractNum w:abstractNumId="16" w15:restartNumberingAfterBreak="0">
     <w:nsid w:val="2E0B2041"/>
     <w:multiLevelType w:val="multilevel"/>
     <w:tmpl w:val="3134098C"/>
@@ -19735,7 +20436,7 @@
       </w:pPr>
     </w:lvl>
   </w:abstractNum>
-  <w:abstractNum w:abstractNumId="15" w15:restartNumberingAfterBreak="0">
+  <w:abstractNum w:abstractNumId="17" w15:restartNumberingAfterBreak="0">
     <w:nsid w:val="317D521C"/>
     <w:multiLevelType w:val="multilevel"/>
     <w:tmpl w:val="6322693E"/>
@@ -19884,7 +20585,7 @@
       </w:rPr>
     </w:lvl>
   </w:abstractNum>
-  <w:abstractNum w:abstractNumId="16" w15:restartNumberingAfterBreak="0">
+  <w:abstractNum w:abstractNumId="18" w15:restartNumberingAfterBreak="0">
     <w:nsid w:val="352918BD"/>
     <w:multiLevelType w:val="multilevel"/>
     <w:tmpl w:val="6D641340"/>
@@ -20001,7 +20702,7 @@
       </w:pPr>
     </w:lvl>
   </w:abstractNum>
-  <w:abstractNum w:abstractNumId="17" w15:restartNumberingAfterBreak="0">
+  <w:abstractNum w:abstractNumId="19" w15:restartNumberingAfterBreak="0">
     <w:nsid w:val="3731193C"/>
     <w:multiLevelType w:val="multilevel"/>
     <w:tmpl w:val="AA7E34E0"/>
@@ -20150,7 +20851,7 @@
       </w:rPr>
     </w:lvl>
   </w:abstractNum>
-  <w:abstractNum w:abstractNumId="18" w15:restartNumberingAfterBreak="0">
+  <w:abstractNum w:abstractNumId="20" w15:restartNumberingAfterBreak="0">
     <w:nsid w:val="39181E88"/>
     <w:multiLevelType w:val="multilevel"/>
     <w:tmpl w:val="ED9C176A"/>
@@ -20263,7 +20964,7 @@
       </w:pPr>
     </w:lvl>
   </w:abstractNum>
-  <w:abstractNum w:abstractNumId="19" w15:restartNumberingAfterBreak="0">
+  <w:abstractNum w:abstractNumId="21" w15:restartNumberingAfterBreak="0">
     <w:nsid w:val="3EDB0629"/>
     <w:multiLevelType w:val="multilevel"/>
     <w:tmpl w:val="FF9C8C72"/>
@@ -20376,7 +21077,7 @@
       </w:pPr>
     </w:lvl>
   </w:abstractNum>
-  <w:abstractNum w:abstractNumId="20" w15:restartNumberingAfterBreak="0">
+  <w:abstractNum w:abstractNumId="22" w15:restartNumberingAfterBreak="0">
     <w:nsid w:val="44424A13"/>
     <w:multiLevelType w:val="multilevel"/>
     <w:tmpl w:val="0B728B0C"/>
@@ -20489,7 +21190,7 @@
       </w:pPr>
     </w:lvl>
   </w:abstractNum>
-  <w:abstractNum w:abstractNumId="21" w15:restartNumberingAfterBreak="0">
+  <w:abstractNum w:abstractNumId="23" w15:restartNumberingAfterBreak="0">
     <w:nsid w:val="4E6D7AA1"/>
     <w:multiLevelType w:val="multilevel"/>
     <w:tmpl w:val="A0BAAB8E"/>
@@ -20638,7 +21339,7 @@
       </w:rPr>
     </w:lvl>
   </w:abstractNum>
-  <w:abstractNum w:abstractNumId="22" w15:restartNumberingAfterBreak="0">
+  <w:abstractNum w:abstractNumId="24" w15:restartNumberingAfterBreak="0">
     <w:nsid w:val="4F274A8E"/>
     <w:multiLevelType w:val="multilevel"/>
     <w:tmpl w:val="EBCA2C0C"/>
@@ -20787,7 +21488,7 @@
       </w:rPr>
     </w:lvl>
   </w:abstractNum>
-  <w:abstractNum w:abstractNumId="23" w15:restartNumberingAfterBreak="0">
+  <w:abstractNum w:abstractNumId="25" w15:restartNumberingAfterBreak="0">
     <w:nsid w:val="5D1D73D6"/>
     <w:multiLevelType w:val="multilevel"/>
     <w:tmpl w:val="4A60C0FE"/>
@@ -20936,7 +21637,7 @@
       </w:rPr>
     </w:lvl>
   </w:abstractNum>
-  <w:abstractNum w:abstractNumId="24" w15:restartNumberingAfterBreak="0">
+  <w:abstractNum w:abstractNumId="26" w15:restartNumberingAfterBreak="0">
     <w:nsid w:val="623D033E"/>
     <w:multiLevelType w:val="multilevel"/>
     <w:tmpl w:val="228EF248"/>
@@ -21085,7 +21786,7 @@
       </w:rPr>
     </w:lvl>
   </w:abstractNum>
-  <w:abstractNum w:abstractNumId="25" w15:restartNumberingAfterBreak="0">
+  <w:abstractNum w:abstractNumId="27" w15:restartNumberingAfterBreak="0">
     <w:nsid w:val="631E526B"/>
     <w:multiLevelType w:val="multilevel"/>
     <w:tmpl w:val="1B7A9088"/>
@@ -21234,7 +21935,7 @@
       </w:rPr>
     </w:lvl>
   </w:abstractNum>
-  <w:abstractNum w:abstractNumId="26" w15:restartNumberingAfterBreak="0">
+  <w:abstractNum w:abstractNumId="28" w15:restartNumberingAfterBreak="0">
     <w:nsid w:val="65176743"/>
     <w:multiLevelType w:val="multilevel"/>
     <w:tmpl w:val="D6061F6A"/>
@@ -21379,7 +22080,7 @@
       </w:rPr>
     </w:lvl>
   </w:abstractNum>
-  <w:abstractNum w:abstractNumId="27" w15:restartNumberingAfterBreak="0">
+  <w:abstractNum w:abstractNumId="29" w15:restartNumberingAfterBreak="0">
     <w:nsid w:val="67434D28"/>
     <w:multiLevelType w:val="multilevel"/>
     <w:tmpl w:val="70F62916"/>
@@ -21528,7 +22229,156 @@
       </w:rPr>
     </w:lvl>
   </w:abstractNum>
-  <w:abstractNum w:abstractNumId="28" w15:restartNumberingAfterBreak="0">
+  <w:abstractNum w:abstractNumId="30" w15:restartNumberingAfterBreak="0">
+    <w:nsid w:val="68874470"/>
+    <w:multiLevelType w:val="multilevel"/>
+    <w:tmpl w:val="6FA4805C"/>
+    <w:lvl w:ilvl="0">
+      <w:start w:val="1"/>
+      <w:numFmt w:val="bullet"/>
+      <w:lvlText w:val=""/>
+      <w:lvlJc w:val="left"/>
+      <w:pPr>
+        <w:tabs>
+          <w:tab w:val="num" w:pos="720"/>
+        </w:tabs>
+        <w:ind w:left="720" w:hanging="360"/>
+      </w:pPr>
+      <w:rPr>
+        <w:rFonts w:ascii="Symbol" w:hAnsi="Symbol" w:hint="default"/>
+        <w:sz w:val="20"/>
+      </w:rPr>
+    </w:lvl>
+    <w:lvl w:ilvl="1" w:tentative="1">
+      <w:start w:val="1"/>
+      <w:numFmt w:val="bullet"/>
+      <w:lvlText w:val="o"/>
+      <w:lvlJc w:val="left"/>
+      <w:pPr>
+        <w:tabs>
+          <w:tab w:val="num" w:pos="1440"/>
+        </w:tabs>
+        <w:ind w:left="1440" w:hanging="360"/>
+      </w:pPr>
+      <w:rPr>
+        <w:rFonts w:ascii="Courier New" w:hAnsi="Courier New" w:hint="default"/>
+        <w:sz w:val="20"/>
+      </w:rPr>
+    </w:lvl>
+    <w:lvl w:ilvl="2" w:tentative="1">
+      <w:start w:val="1"/>
+      <w:numFmt w:val="bullet"/>
+      <w:lvlText w:val=""/>
+      <w:lvlJc w:val="left"/>
+      <w:pPr>
+        <w:tabs>
+          <w:tab w:val="num" w:pos="2160"/>
+        </w:tabs>
+        <w:ind w:left="2160" w:hanging="360"/>
+      </w:pPr>
+      <w:rPr>
+        <w:rFonts w:ascii="Wingdings" w:hAnsi="Wingdings" w:hint="default"/>
+        <w:sz w:val="20"/>
+      </w:rPr>
+    </w:lvl>
+    <w:lvl w:ilvl="3" w:tentative="1">
+      <w:start w:val="1"/>
+      <w:numFmt w:val="bullet"/>
+      <w:lvlText w:val=""/>
+      <w:lvlJc w:val="left"/>
+      <w:pPr>
+        <w:tabs>
+          <w:tab w:val="num" w:pos="2880"/>
+        </w:tabs>
+        <w:ind w:left="2880" w:hanging="360"/>
+      </w:pPr>
+      <w:rPr>
+        <w:rFonts w:ascii="Wingdings" w:hAnsi="Wingdings" w:hint="default"/>
+        <w:sz w:val="20"/>
+      </w:rPr>
+    </w:lvl>
+    <w:lvl w:ilvl="4" w:tentative="1">
+      <w:start w:val="1"/>
+      <w:numFmt w:val="bullet"/>
+      <w:lvlText w:val=""/>
+      <w:lvlJc w:val="left"/>
+      <w:pPr>
+        <w:tabs>
+          <w:tab w:val="num" w:pos="3600"/>
+        </w:tabs>
+        <w:ind w:left="3600" w:hanging="360"/>
+      </w:pPr>
+      <w:rPr>
+        <w:rFonts w:ascii="Wingdings" w:hAnsi="Wingdings" w:hint="default"/>
+        <w:sz w:val="20"/>
+      </w:rPr>
+    </w:lvl>
+    <w:lvl w:ilvl="5" w:tentative="1">
+      <w:start w:val="1"/>
+      <w:numFmt w:val="bullet"/>
+      <w:lvlText w:val=""/>
+      <w:lvlJc w:val="left"/>
+      <w:pPr>
+        <w:tabs>
+          <w:tab w:val="num" w:pos="4320"/>
+        </w:tabs>
+        <w:ind w:left="4320" w:hanging="360"/>
+      </w:pPr>
+      <w:rPr>
+        <w:rFonts w:ascii="Wingdings" w:hAnsi="Wingdings" w:hint="default"/>
+        <w:sz w:val="20"/>
+      </w:rPr>
+    </w:lvl>
+    <w:lvl w:ilvl="6" w:tentative="1">
+      <w:start w:val="1"/>
+      <w:numFmt w:val="bullet"/>
+      <w:lvlText w:val=""/>
+      <w:lvlJc w:val="left"/>
+      <w:pPr>
+        <w:tabs>
+          <w:tab w:val="num" w:pos="5040"/>
+        </w:tabs>
+        <w:ind w:left="5040" w:hanging="360"/>
+      </w:pPr>
+      <w:rPr>
+        <w:rFonts w:ascii="Wingdings" w:hAnsi="Wingdings" w:hint="default"/>
+        <w:sz w:val="20"/>
+      </w:rPr>
+    </w:lvl>
+    <w:lvl w:ilvl="7" w:tentative="1">
+      <w:start w:val="1"/>
+      <w:numFmt w:val="bullet"/>
+      <w:lvlText w:val=""/>
+      <w:lvlJc w:val="left"/>
+      <w:pPr>
+        <w:tabs>
+          <w:tab w:val="num" w:pos="5760"/>
+        </w:tabs>
+        <w:ind w:left="5760" w:hanging="360"/>
+      </w:pPr>
+      <w:rPr>
+        <w:rFonts w:ascii="Wingdings" w:hAnsi="Wingdings" w:hint="default"/>
+        <w:sz w:val="20"/>
+      </w:rPr>
+    </w:lvl>
+    <w:lvl w:ilvl="8" w:tentative="1">
+      <w:start w:val="1"/>
+      <w:numFmt w:val="bullet"/>
+      <w:lvlText w:val=""/>
+      <w:lvlJc w:val="left"/>
+      <w:pPr>
+        <w:tabs>
+          <w:tab w:val="num" w:pos="6480"/>
+        </w:tabs>
+        <w:ind w:left="6480" w:hanging="360"/>
+      </w:pPr>
+      <w:rPr>
+        <w:rFonts w:ascii="Wingdings" w:hAnsi="Wingdings" w:hint="default"/>
+        <w:sz w:val="20"/>
+      </w:rPr>
+    </w:lvl>
+  </w:abstractNum>
+  <w:abstractNum w:abstractNumId="31" w15:restartNumberingAfterBreak="0">
     <w:nsid w:val="6C50788C"/>
     <w:multiLevelType w:val="multilevel"/>
     <w:tmpl w:val="CEA4E664"/>
@@ -21641,7 +22491,7 @@
       </w:pPr>
     </w:lvl>
   </w:abstractNum>
-  <w:abstractNum w:abstractNumId="29" w15:restartNumberingAfterBreak="0">
+  <w:abstractNum w:abstractNumId="32" w15:restartNumberingAfterBreak="0">
     <w:nsid w:val="6F5F714E"/>
     <w:multiLevelType w:val="multilevel"/>
     <w:tmpl w:val="25F0B76A"/>
@@ -21754,7 +22604,7 @@
       </w:pPr>
     </w:lvl>
   </w:abstractNum>
-  <w:abstractNum w:abstractNumId="30" w15:restartNumberingAfterBreak="0">
+  <w:abstractNum w:abstractNumId="33" w15:restartNumberingAfterBreak="0">
     <w:nsid w:val="70AB1982"/>
     <w:multiLevelType w:val="multilevel"/>
     <w:tmpl w:val="A8A2E5A0"/>
@@ -21903,7 +22753,7 @@
       </w:rPr>
     </w:lvl>
   </w:abstractNum>
-  <w:abstractNum w:abstractNumId="31" w15:restartNumberingAfterBreak="0">
+  <w:abstractNum w:abstractNumId="34" w15:restartNumberingAfterBreak="0">
     <w:nsid w:val="72FF61DD"/>
     <w:multiLevelType w:val="multilevel"/>
     <w:tmpl w:val="40043C82"/>
@@ -22016,7 +22866,7 @@
       </w:pPr>
     </w:lvl>
   </w:abstractNum>
-  <w:abstractNum w:abstractNumId="32" w15:restartNumberingAfterBreak="0">
+  <w:abstractNum w:abstractNumId="35" w15:restartNumberingAfterBreak="0">
     <w:nsid w:val="745C4099"/>
     <w:multiLevelType w:val="multilevel"/>
     <w:tmpl w:val="D4881822"/>
@@ -22165,7 +23015,7 @@
       </w:rPr>
     </w:lvl>
   </w:abstractNum>
-  <w:abstractNum w:abstractNumId="33" w15:restartNumberingAfterBreak="0">
+  <w:abstractNum w:abstractNumId="36" w15:restartNumberingAfterBreak="0">
     <w:nsid w:val="75AF1494"/>
     <w:multiLevelType w:val="multilevel"/>
     <w:tmpl w:val="32D69A92"/>
@@ -22314,7 +23164,7 @@
       </w:rPr>
     </w:lvl>
   </w:abstractNum>
-  <w:abstractNum w:abstractNumId="34" w15:restartNumberingAfterBreak="0">
+  <w:abstractNum w:abstractNumId="37" w15:restartNumberingAfterBreak="0">
     <w:nsid w:val="77E15088"/>
     <w:multiLevelType w:val="multilevel"/>
     <w:tmpl w:val="6AC45D90"/>
@@ -22464,109 +23314,118 @@
     </w:lvl>
   </w:abstractNum>
   <w:num w:numId="1" w16cid:durableId="677005529">
-    <w:abstractNumId w:val="25"/>
+    <w:abstractNumId w:val="27"/>
   </w:num>
   <w:num w:numId="2" w16cid:durableId="1911575240">
+    <w:abstractNumId w:val="18"/>
+  </w:num>
+  <w:num w:numId="3" w16cid:durableId="1812941074">
+    <w:abstractNumId w:val="34"/>
+  </w:num>
+  <w:num w:numId="4" w16cid:durableId="2072338843">
+    <w:abstractNumId w:val="32"/>
+  </w:num>
+  <w:num w:numId="5" w16cid:durableId="1494949181">
     <w:abstractNumId w:val="16"/>
   </w:num>
-  <w:num w:numId="3" w16cid:durableId="1812941074">
-    <w:abstractNumId w:val="31"/>
+  <w:num w:numId="6" w16cid:durableId="1009141849">
+    <w:abstractNumId w:val="8"/>
   </w:num>
-  <w:num w:numId="4" w16cid:durableId="2072338843">
+  <w:num w:numId="7" w16cid:durableId="1836798672">
+    <w:abstractNumId w:val="17"/>
+  </w:num>
+  <w:num w:numId="8" w16cid:durableId="1075592526">
+    <w:abstractNumId w:val="10"/>
+  </w:num>
+  <w:num w:numId="9" w16cid:durableId="1087071079">
     <w:abstractNumId w:val="29"/>
   </w:num>
-  <w:num w:numId="5" w16cid:durableId="1494949181">
-    <w:abstractNumId w:val="14"/>
-  </w:num>
-  <w:num w:numId="6" w16cid:durableId="1009141849">
-    <w:abstractNumId w:val="7"/>
-  </w:num>
-  <w:num w:numId="7" w16cid:durableId="1836798672">
-    <w:abstractNumId w:val="15"/>
-  </w:num>
-  <w:num w:numId="8" w16cid:durableId="1075592526">
-    <w:abstractNumId w:val="9"/>
-  </w:num>
-  <w:num w:numId="9" w16cid:durableId="1087071079">
-    <w:abstractNumId w:val="27"/>
-  </w:num>
   <w:num w:numId="10" w16cid:durableId="2026246117">
-    <w:abstractNumId w:val="30"/>
+    <w:abstractNumId w:val="33"/>
   </w:num>
   <w:num w:numId="11" w16cid:durableId="71975469">
-    <w:abstractNumId w:val="11"/>
+    <w:abstractNumId w:val="13"/>
   </w:num>
   <w:num w:numId="12" w16cid:durableId="1590970451">
     <w:abstractNumId w:val="4"/>
   </w:num>
   <w:num w:numId="13" w16cid:durableId="1947956297">
-    <w:abstractNumId w:val="20"/>
+    <w:abstractNumId w:val="22"/>
   </w:num>
   <w:num w:numId="14" w16cid:durableId="637493007">
-    <w:abstractNumId w:val="28"/>
+    <w:abstractNumId w:val="31"/>
   </w:num>
   <w:num w:numId="15" w16cid:durableId="1135491906">
     <w:abstractNumId w:val="2"/>
   </w:num>
   <w:num w:numId="16" w16cid:durableId="1358579186">
-    <w:abstractNumId w:val="10"/>
+    <w:abstractNumId w:val="11"/>
   </w:num>
   <w:num w:numId="17" w16cid:durableId="680468117">
     <w:abstractNumId w:val="3"/>
   </w:num>
   <w:num w:numId="18" w16cid:durableId="1464998975">
-    <w:abstractNumId w:val="13"/>
+    <w:abstractNumId w:val="15"/>
   </w:num>
   <w:num w:numId="19" w16cid:durableId="807555087">
-    <w:abstractNumId w:val="33"/>
+    <w:abstractNumId w:val="36"/>
   </w:num>
   <w:num w:numId="20" w16cid:durableId="131096129">
     <w:abstractNumId w:val="0"/>
   </w:num>
   <w:num w:numId="21" w16cid:durableId="988248673">
-    <w:abstractNumId w:val="23"/>
+    <w:abstractNumId w:val="25"/>
   </w:num>
   <w:num w:numId="22" w16cid:durableId="936980356">
-    <w:abstractNumId w:val="24"/>
+    <w:abstractNumId w:val="26"/>
   </w:num>
   <w:num w:numId="23" w16cid:durableId="387656006">
-    <w:abstractNumId w:val="26"/>
+    <w:abstractNumId w:val="28"/>
   </w:num>
   <w:num w:numId="24" w16cid:durableId="570819318">
-    <w:abstractNumId w:val="12"/>
+    <w:abstractNumId w:val="14"/>
   </w:num>
   <w:num w:numId="25" w16cid:durableId="1659528725">
-    <w:abstractNumId w:val="18"/>
+    <w:abstractNumId w:val="20"/>
   </w:num>
   <w:num w:numId="26" w16cid:durableId="94523269">
     <w:abstractNumId w:val="5"/>
   </w:num>
   <w:num w:numId="27" w16cid:durableId="369231119">
-    <w:abstractNumId w:val="32"/>
+    <w:abstractNumId w:val="35"/>
   </w:num>
   <w:num w:numId="28" w16cid:durableId="615873367">
-    <w:abstractNumId w:val="22"/>
+    <w:abstractNumId w:val="24"/>
   </w:num>
   <w:num w:numId="29" w16cid:durableId="1786805636">
-    <w:abstractNumId w:val="21"/>
+    <w:abstractNumId w:val="23"/>
   </w:num>
   <w:num w:numId="30" w16cid:durableId="1298339490">
-    <w:abstractNumId w:val="19"/>
+    <w:abstractNumId w:val="21"/>
   </w:num>
   <w:num w:numId="31" w16cid:durableId="1506096837">
     <w:abstractNumId w:val="1"/>
   </w:num>
   <w:num w:numId="32" w16cid:durableId="1738162433">
-    <w:abstractNumId w:val="34"/>
+    <w:abstractNumId w:val="37"/>
   </w:num>
   <w:num w:numId="33" w16cid:durableId="374356395">
-    <w:abstractNumId w:val="6"/>
+    <w:abstractNumId w:val="7"/>
   </w:num>
   <w:num w:numId="34" w16cid:durableId="765274493">
-    <w:abstractNumId w:val="8"/>
+    <w:abstractNumId w:val="9"/>
   </w:num>
   <w:num w:numId="35" w16cid:durableId="2115396326">
-    <w:abstractNumId w:val="17"/>
+    <w:abstractNumId w:val="19"/>
+  </w:num>
+  <w:num w:numId="36" w16cid:durableId="1688289680">
+    <w:abstractNumId w:val="12"/>
+  </w:num>
+  <w:num w:numId="37" w16cid:durableId="1646277676">
+    <w:abstractNumId w:val="30"/>
+  </w:num>
+  <w:num w:numId="38" w16cid:durableId="104273762">
+    <w:abstractNumId w:val="6"/>
   </w:num>
 </w:numbering>
 </file>

</xml_diff>